<commit_message>
Add .py file, reflection, comparison, ai_usage
</commit_message>
<xml_diff>
--- a/stage01/Stage_1_Lab_Student_Handout.docx
+++ b/stage01/Stage_1_Lab_Student_Handout.docx
@@ -1,6 +1,6 @@
 
 <file path=word/document.xml><?xml version="1.0" encoding="utf-8"?>
-<w:document xmlns:wpc="http://schemas.microsoft.com/office/word/2010/wordprocessingCanvas" xmlns:cx="http://schemas.microsoft.com/office/drawing/2014/chartex" xmlns:cx1="http://schemas.microsoft.com/office/drawing/2015/9/8/chartex" xmlns:cx2="http://schemas.microsoft.com/office/drawing/2015/10/21/chartex" xmlns:cx3="http://schemas.microsoft.com/office/drawing/2016/5/9/chartex" xmlns:cx4="http://schemas.microsoft.com/office/drawing/2016/5/10/chartex" xmlns:cx5="http://schemas.microsoft.com/office/drawing/2016/5/11/chartex" xmlns:cx6="http://schemas.microsoft.com/office/drawing/2016/5/12/chartex" xmlns:cx7="http://schemas.microsoft.com/office/drawing/2016/5/13/chartex" xmlns:cx8="http://schemas.microsoft.com/office/drawing/2016/5/14/chartex" xmlns:mc="http://schemas.openxmlformats.org/markup-compatibility/2006" xmlns:aink="http://schemas.microsoft.com/office/drawing/2016/ink" xmlns:am3d="http://schemas.microsoft.com/office/drawing/2017/model3d" xmlns:o="urn:schemas-microsoft-com:office:office" xmlns:oel="http://schemas.microsoft.com/office/2019/extlst" xmlns:r="http://schemas.openxmlformats.org/officeDocument/2006/relationships" xmlns:m="http://schemas.openxmlformats.org/officeDocument/2006/math" xmlns:v="urn:schemas-microsoft-com:vml" xmlns:wp14="http://schemas.microsoft.com/office/word/2010/wordprocessingDrawing" xmlns:wp="http://schemas.openxmlformats.org/drawingml/2006/wordprocessingDrawing" xmlns:w10="urn:schemas-microsoft-com:office:word" xmlns:w="http://schemas.openxmlformats.org/wordprocessingml/2006/main" xmlns:w14="http://schemas.microsoft.com/office/word/2010/wordml" xmlns:w15="http://schemas.microsoft.com/office/word/2012/wordml" xmlns:w16cei="http://schemas.microsoft.com/office/word/2026/wordml/cei" xmlns:w16cex="http://schemas.microsoft.com/office/word/2018/wordml/cex" xmlns:w16cid="http://schemas.microsoft.com/office/word/2016/wordml/cid" xmlns:w16="http://schemas.microsoft.com/office/word/2018/wordml" xmlns:w16du="http://schemas.microsoft.com/office/word/2023/wordml/word16du" xmlns:w16sdtdh="http://schemas.microsoft.com/office/word/2020/wordml/sdtdatahash" xmlns:w16sdtfl="http://schemas.microsoft.com/office/word/2024/wordml/sdtformatlock" xmlns:w16se="http://schemas.microsoft.com/office/word/2015/wordml/symex" xmlns:wpg="http://schemas.microsoft.com/office/word/2010/wordprocessingGroup" xmlns:wpi="http://schemas.microsoft.com/office/word/2010/wordprocessingInk" xmlns:wne="http://schemas.microsoft.com/office/word/2006/wordml" xmlns:wps="http://schemas.microsoft.com/office/word/2010/wordprocessingShape" mc:Ignorable="w14 w15 w16se w16cid w16 w16cex w16sdtdh w16sdtfl w16du wp14">
+<w:document xmlns:wpc="http://schemas.microsoft.com/office/word/2010/wordprocessingCanvas" xmlns:cx="http://schemas.microsoft.com/office/drawing/2014/chartex" xmlns:cx1="http://schemas.microsoft.com/office/drawing/2015/9/8/chartex" xmlns:cx2="http://schemas.microsoft.com/office/drawing/2015/10/21/chartex" xmlns:cx3="http://schemas.microsoft.com/office/drawing/2016/5/9/chartex" xmlns:cx4="http://schemas.microsoft.com/office/drawing/2016/5/10/chartex" xmlns:cx5="http://schemas.microsoft.com/office/drawing/2016/5/11/chartex" xmlns:cx6="http://schemas.microsoft.com/office/drawing/2016/5/12/chartex" xmlns:cx7="http://schemas.microsoft.com/office/drawing/2016/5/13/chartex" xmlns:cx8="http://schemas.microsoft.com/office/drawing/2016/5/14/chartex" xmlns:mc="http://schemas.openxmlformats.org/markup-compatibility/2006" xmlns:aink="http://schemas.microsoft.com/office/drawing/2016/ink" xmlns:am3d="http://schemas.microsoft.com/office/drawing/2017/model3d" xmlns:o="urn:schemas-microsoft-com:office:office" xmlns:oel="http://schemas.microsoft.com/office/2019/extlst" xmlns:r="http://schemas.openxmlformats.org/officeDocument/2006/relationships" xmlns:m="http://schemas.openxmlformats.org/officeDocument/2006/math" xmlns:v="urn:schemas-microsoft-com:vml" xmlns:wp14="http://schemas.microsoft.com/office/word/2010/wordprocessingDrawing" xmlns:wp="http://schemas.openxmlformats.org/drawingml/2006/wordprocessingDrawing" xmlns:w10="urn:schemas-microsoft-com:office:word" xmlns:w="http://schemas.openxmlformats.org/wordprocessingml/2006/main" xmlns:w14="http://schemas.microsoft.com/office/word/2010/wordml" xmlns:w15="http://schemas.microsoft.com/office/word/2012/wordml" xmlns:w16cex="http://schemas.microsoft.com/office/word/2018/wordml/cex" xmlns:w16cid="http://schemas.microsoft.com/office/word/2016/wordml/cid" xmlns:w16="http://schemas.microsoft.com/office/word/2018/wordml" xmlns:w16du="http://schemas.microsoft.com/office/word/2023/wordml/word16du" xmlns:w16sdtdh="http://schemas.microsoft.com/office/word/2020/wordml/sdtdatahash" xmlns:w16sdtfl="http://schemas.microsoft.com/office/word/2024/wordml/sdtformatlock" xmlns:w16se="http://schemas.microsoft.com/office/word/2015/wordml/symex" xmlns:wpg="http://schemas.microsoft.com/office/word/2010/wordprocessingGroup" xmlns:wpi="http://schemas.microsoft.com/office/word/2010/wordprocessingInk" xmlns:wne="http://schemas.microsoft.com/office/word/2006/wordml" xmlns:wps="http://schemas.microsoft.com/office/word/2010/wordprocessingShape" mc:Ignorable="w14 w15 w16se w16cid w16 w16cex w16sdtdh w16sdtfl w16du wp14">
   <w:body>
     <w:p>
       <w:pPr>
@@ -8,35 +8,42 @@
         <w:jc w:val="center"/>
       </w:pPr>
       <w:r>
-        <w:t xml:space="preserve">Stage </w:t>
-      </w:r>
-      <w:r>
-        <w:t>1</w:t>
-      </w:r>
-      <w:r>
-        <w:t xml:space="preserve"> Lab</w:t>
-      </w:r>
-      <w:r>
-        <w:t xml:space="preserve"> - Human vs AI: Building Your First SmartCare Prototype</w:t>
+        <w:t>Stage 1 Lab - Human vs AI: Building Your First SmartCare Prototype</w:t>
       </w:r>
     </w:p>
     <w:p>
       <w:pPr>
-        <w:pStyle w:val="Heading1"/>
-      </w:pPr>
-      <w:r>
-        <w:t>Learning objectives</w:t>
+        <w:rPr>
+          <w:color w:val="31849B" w:themeColor="accent5" w:themeShade="BF"/>
+        </w:rPr>
+      </w:pPr>
+      <w:r>
+        <w:rPr>
+          <w:color w:val="31849B" w:themeColor="accent5" w:themeShade="BF"/>
+        </w:rPr>
+        <w:t xml:space="preserve">Note: all edits are in colour </w:t>
+      </w:r>
+      <w:r>
+        <w:rPr>
+          <w:b/>
+          <w:bCs/>
+          <w:color w:val="31849B" w:themeColor="accent5" w:themeShade="BF"/>
+        </w:rPr>
+        <w:t>blue</w:t>
+      </w:r>
+      <w:r>
+        <w:rPr>
+          <w:color w:val="31849B" w:themeColor="accent5" w:themeShade="BF"/>
+        </w:rPr>
+        <w:t>.</w:t>
       </w:r>
     </w:p>
     <w:p>
       <w:pPr>
-        <w:pStyle w:val="ListBullet"/>
-      </w:pPr>
-      <w:r>
-        <w:t>Create and run a simple Python file</w:t>
-      </w:r>
-      <w:r>
-        <w:t xml:space="preserve"> with basic input,output and processing statements</w:t>
+        <w:pStyle w:val="Heading1"/>
+      </w:pPr>
+      <w:r>
+        <w:t>Learning objectives</w:t>
       </w:r>
     </w:p>
     <w:p>
@@ -44,10 +51,20 @@
         <w:pStyle w:val="ListBullet"/>
       </w:pPr>
       <w:r>
-        <w:t>Use lists, dictionaries and functions</w:t>
-      </w:r>
-      <w:r>
-        <w:t xml:space="preserve"> to enhance the Python file</w:t>
+        <w:t>Create and run a simple Python file</w:t>
+      </w:r>
+      <w:r>
+        <w:t xml:space="preserve"> with basic </w:t>
+      </w:r>
+      <w:proofErr w:type="spellStart"/>
+      <w:proofErr w:type="gramStart"/>
+      <w:r>
+        <w:t>input,output</w:t>
+      </w:r>
+      <w:proofErr w:type="spellEnd"/>
+      <w:proofErr w:type="gramEnd"/>
+      <w:r>
+        <w:t xml:space="preserve"> and processing statements</w:t>
       </w:r>
     </w:p>
     <w:p>
@@ -55,7 +72,10 @@
         <w:pStyle w:val="ListBullet"/>
       </w:pPr>
       <w:r>
-        <w:t>Build a small SmartCare appointment prototype.</w:t>
+        <w:t>Use lists, dictionaries and functions</w:t>
+      </w:r>
+      <w:r>
+        <w:t xml:space="preserve"> to enhance the Python file</w:t>
       </w:r>
     </w:p>
     <w:p>
@@ -63,7 +83,7 @@
         <w:pStyle w:val="ListBullet"/>
       </w:pPr>
       <w:r>
-        <w:t>Use AI as a tutor rather than a replacement.</w:t>
+        <w:t>Build a small SmartCare appointment prototype.</w:t>
       </w:r>
     </w:p>
     <w:p>
@@ -71,7 +91,7 @@
         <w:pStyle w:val="ListBullet"/>
       </w:pPr>
       <w:r>
-        <w:t>Compare human-written and AI-generated code.</w:t>
+        <w:t>Use AI as a tutor rather than a replacement.</w:t>
       </w:r>
     </w:p>
     <w:p>
@@ -79,7 +99,7 @@
         <w:pStyle w:val="ListBullet"/>
       </w:pPr>
       <w:r>
-        <w:t>Verify AI-generated code through execution and test inputs.</w:t>
+        <w:t>Compare human-written and AI-generated code.</w:t>
       </w:r>
     </w:p>
     <w:p>
@@ -87,26 +107,31 @@
         <w:pStyle w:val="ListBullet"/>
       </w:pPr>
       <w:r>
-        <w:t>Document a short AI-use reflection.</w:t>
+        <w:t>Verify AI-generated code through execution and test inputs.</w:t>
       </w:r>
     </w:p>
     <w:p>
       <w:pPr>
-        <w:pStyle w:val="Heading1"/>
-      </w:pPr>
-      <w:r>
-        <w:t>Files to create</w:t>
-      </w:r>
-      <w:r>
-        <w:t xml:space="preserve"> and commit in GitHub</w:t>
+        <w:pStyle w:val="ListBullet"/>
+      </w:pPr>
+      <w:r>
+        <w:t>Document a short AI-use reflection.</w:t>
       </w:r>
     </w:p>
     <w:p>
-      <w:r>
-        <w:t>stage</w:t>
-      </w:r>
-      <w:r>
-        <w:t>01/</w:t>
+      <w:pPr>
+        <w:pStyle w:val="Heading1"/>
+      </w:pPr>
+      <w:r>
+        <w:t>Files to create</w:t>
+      </w:r>
+      <w:r>
+        <w:t xml:space="preserve"> and commit in GitHub</w:t>
+      </w:r>
+    </w:p>
+    <w:p>
+      <w:r>
+        <w:t>stage01/</w:t>
       </w:r>
       <w:r>
         <w:br/>
@@ -141,6 +166,9 @@
     <w:p>
       <w:r>
         <w:t>What data must be stored?</w:t>
+      </w:r>
+      <w:r>
+        <w:t xml:space="preserve"> </w:t>
       </w:r>
     </w:p>
     <w:p>
@@ -196,62 +224,66 @@
           <w:b/>
           <w:bCs/>
         </w:rPr>
-        <w:t># Create and run a simple Python file with basic input,output statements</w:t>
-      </w:r>
-    </w:p>
-    <w:p>
-      <w:pPr>
-        <w:spacing w:after="0"/>
+        <w:t xml:space="preserve"># Create and run a simple Python file with basic </w:t>
+      </w:r>
+      <w:proofErr w:type="spellStart"/>
+      <w:proofErr w:type="gramStart"/>
+      <w:r>
         <w:rPr>
           <w:rFonts w:ascii="Courier New" w:hAnsi="Courier New" w:cs="Courier New"/>
           <w:b/>
           <w:bCs/>
         </w:rPr>
-      </w:pPr>
-    </w:p>
-    <w:p>
-      <w:pPr>
-        <w:spacing w:after="0"/>
+        <w:t>input,output</w:t>
+      </w:r>
+      <w:proofErr w:type="spellEnd"/>
+      <w:proofErr w:type="gramEnd"/>
+      <w:r>
         <w:rPr>
           <w:rFonts w:ascii="Courier New" w:hAnsi="Courier New" w:cs="Courier New"/>
           <w:b/>
           <w:bCs/>
         </w:rPr>
-      </w:pPr>
-      <w:r>
+        <w:t xml:space="preserve"> statements</w:t>
+      </w:r>
+    </w:p>
+    <w:p>
+      <w:pPr>
+        <w:spacing w:after="0"/>
         <w:rPr>
           <w:rFonts w:ascii="Courier New" w:hAnsi="Courier New" w:cs="Courier New"/>
           <w:b/>
           <w:bCs/>
         </w:rPr>
-        <w:t xml:space="preserve">print("Welcome to SmartCare: Community Clinic </w:t>
-      </w:r>
-      <w:r>
+      </w:pPr>
+    </w:p>
+    <w:p>
+      <w:pPr>
+        <w:spacing w:after="0"/>
         <w:rPr>
           <w:rFonts w:ascii="Courier New" w:hAnsi="Courier New" w:cs="Courier New"/>
           <w:b/>
           <w:bCs/>
         </w:rPr>
-        <w:t>Appointment Booking</w:t>
-      </w:r>
+      </w:pPr>
+      <w:proofErr w:type="gramStart"/>
       <w:r>
         <w:rPr>
           <w:rFonts w:ascii="Courier New" w:hAnsi="Courier New" w:cs="Courier New"/>
           <w:b/>
           <w:bCs/>
         </w:rPr>
-        <w:t xml:space="preserve"> System!")</w:t>
-      </w:r>
-    </w:p>
-    <w:p>
-      <w:pPr>
-        <w:spacing w:after="0"/>
+        <w:t>print(</w:t>
+      </w:r>
+      <w:proofErr w:type="gramEnd"/>
+      <w:r>
         <w:rPr>
           <w:rFonts w:ascii="Courier New" w:hAnsi="Courier New" w:cs="Courier New"/>
           <w:b/>
           <w:bCs/>
         </w:rPr>
-      </w:pPr>
+        <w:t>"Welcome to SmartCare: Community Clinic Appointment Booking System!")</w:t>
+      </w:r>
     </w:p>
     <w:p>
       <w:pPr>
@@ -262,114 +294,116 @@
           <w:bCs/>
         </w:rPr>
       </w:pPr>
-      <w:r>
+    </w:p>
+    <w:p>
+      <w:pPr>
+        <w:spacing w:after="0"/>
         <w:rPr>
           <w:rFonts w:ascii="Courier New" w:hAnsi="Courier New" w:cs="Courier New"/>
           <w:b/>
           <w:bCs/>
         </w:rPr>
-        <w:t># First Appointment</w:t>
-      </w:r>
-    </w:p>
-    <w:p>
-      <w:pPr>
-        <w:spacing w:after="0"/>
+      </w:pPr>
+      <w:r>
         <w:rPr>
           <w:rFonts w:ascii="Courier New" w:hAnsi="Courier New" w:cs="Courier New"/>
           <w:b/>
           <w:bCs/>
         </w:rPr>
-      </w:pPr>
-      <w:r>
+        <w:t># First Appointment</w:t>
+      </w:r>
+    </w:p>
+    <w:p>
+      <w:pPr>
+        <w:spacing w:after="0"/>
         <w:rPr>
           <w:rFonts w:ascii="Courier New" w:hAnsi="Courier New" w:cs="Courier New"/>
           <w:b/>
           <w:bCs/>
         </w:rPr>
-        <w:t>patient1_name = 'Alice Smith'</w:t>
-      </w:r>
-    </w:p>
-    <w:p>
-      <w:pPr>
-        <w:spacing w:after="0"/>
+      </w:pPr>
+      <w:r>
         <w:rPr>
           <w:rFonts w:ascii="Courier New" w:hAnsi="Courier New" w:cs="Courier New"/>
           <w:b/>
           <w:bCs/>
         </w:rPr>
-      </w:pPr>
-      <w:r>
+        <w:lastRenderedPageBreak/>
+        <w:t>patient1_name = 'Alice Smith'</w:t>
+      </w:r>
+    </w:p>
+    <w:p>
+      <w:pPr>
+        <w:spacing w:after="0"/>
         <w:rPr>
           <w:rFonts w:ascii="Courier New" w:hAnsi="Courier New" w:cs="Courier New"/>
           <w:b/>
           <w:bCs/>
         </w:rPr>
-        <w:t>practitioner1_name = 'Dr. John Doe'</w:t>
-      </w:r>
-    </w:p>
-    <w:p>
-      <w:pPr>
-        <w:spacing w:after="0"/>
+      </w:pPr>
+      <w:r>
         <w:rPr>
           <w:rFonts w:ascii="Courier New" w:hAnsi="Courier New" w:cs="Courier New"/>
           <w:b/>
           <w:bCs/>
         </w:rPr>
-      </w:pPr>
-      <w:r>
+        <w:t>practitioner1_name = 'Dr. John Doe'</w:t>
+      </w:r>
+    </w:p>
+    <w:p>
+      <w:pPr>
+        <w:spacing w:after="0"/>
         <w:rPr>
           <w:rFonts w:ascii="Courier New" w:hAnsi="Courier New" w:cs="Courier New"/>
           <w:b/>
           <w:bCs/>
         </w:rPr>
-        <w:t>appointment1_time = '2024-07-20 10:00 AM'</w:t>
-      </w:r>
-    </w:p>
-    <w:p>
-      <w:pPr>
-        <w:spacing w:after="0"/>
+      </w:pPr>
+      <w:r>
         <w:rPr>
           <w:rFonts w:ascii="Courier New" w:hAnsi="Courier New" w:cs="Courier New"/>
           <w:b/>
           <w:bCs/>
         </w:rPr>
-      </w:pPr>
-      <w:r>
+        <w:t>appointment1_time = '2024-07-20 10:00 AM'</w:t>
+      </w:r>
+    </w:p>
+    <w:p>
+      <w:pPr>
+        <w:spacing w:after="0"/>
         <w:rPr>
           <w:rFonts w:ascii="Courier New" w:hAnsi="Courier New" w:cs="Courier New"/>
           <w:b/>
           <w:bCs/>
         </w:rPr>
-        <w:lastRenderedPageBreak/>
-        <w:t>print(f"Patient: {patient1_name} | Practitioner: {practitioner1_name} | Time: {appointment1_time}")</w:t>
-      </w:r>
-    </w:p>
-    <w:p>
-      <w:pPr>
-        <w:spacing w:after="0"/>
+      </w:pPr>
+      <w:proofErr w:type="gramStart"/>
+      <w:r>
         <w:rPr>
           <w:rFonts w:ascii="Courier New" w:hAnsi="Courier New" w:cs="Courier New"/>
           <w:b/>
           <w:bCs/>
         </w:rPr>
-      </w:pPr>
-    </w:p>
-    <w:p>
-      <w:pPr>
-        <w:spacing w:after="0"/>
+        <w:t>print(</w:t>
+      </w:r>
+      <w:proofErr w:type="spellStart"/>
+      <w:proofErr w:type="gramEnd"/>
+      <w:r>
         <w:rPr>
           <w:rFonts w:ascii="Courier New" w:hAnsi="Courier New" w:cs="Courier New"/>
           <w:b/>
           <w:bCs/>
         </w:rPr>
-      </w:pPr>
+        <w:t>f"Patient</w:t>
+      </w:r>
+      <w:proofErr w:type="spellEnd"/>
       <w:r>
         <w:rPr>
           <w:rFonts w:ascii="Courier New" w:hAnsi="Courier New" w:cs="Courier New"/>
           <w:b/>
           <w:bCs/>
         </w:rPr>
-        <w:t># Second Appointment</w:t>
+        <w:t>: {patient1_name} | Practitioner: {practitioner1_name} | Time: {appointment1_time}")</w:t>
       </w:r>
     </w:p>
     <w:p>
@@ -381,67 +415,115 @@
           <w:bCs/>
         </w:rPr>
       </w:pPr>
-      <w:r>
+    </w:p>
+    <w:p>
+      <w:pPr>
+        <w:spacing w:after="0"/>
         <w:rPr>
           <w:rFonts w:ascii="Courier New" w:hAnsi="Courier New" w:cs="Courier New"/>
           <w:b/>
           <w:bCs/>
         </w:rPr>
-        <w:t>patient2_name = 'Bob Johnson'</w:t>
-      </w:r>
-    </w:p>
-    <w:p>
-      <w:pPr>
-        <w:spacing w:after="0"/>
+      </w:pPr>
+      <w:r>
         <w:rPr>
           <w:rFonts w:ascii="Courier New" w:hAnsi="Courier New" w:cs="Courier New"/>
           <w:b/>
           <w:bCs/>
         </w:rPr>
-      </w:pPr>
-      <w:r>
+        <w:t># Second Appointment</w:t>
+      </w:r>
+    </w:p>
+    <w:p>
+      <w:pPr>
+        <w:spacing w:after="0"/>
         <w:rPr>
           <w:rFonts w:ascii="Courier New" w:hAnsi="Courier New" w:cs="Courier New"/>
           <w:b/>
           <w:bCs/>
         </w:rPr>
-        <w:t>practitioner2_name = 'Dr. Jane Roe'</w:t>
-      </w:r>
-    </w:p>
-    <w:p>
-      <w:pPr>
-        <w:spacing w:after="0"/>
+      </w:pPr>
+      <w:r>
         <w:rPr>
           <w:rFonts w:ascii="Courier New" w:hAnsi="Courier New" w:cs="Courier New"/>
           <w:b/>
           <w:bCs/>
         </w:rPr>
-      </w:pPr>
-      <w:r>
+        <w:t>patient2_name = 'Bob Johnson'</w:t>
+      </w:r>
+    </w:p>
+    <w:p>
+      <w:pPr>
+        <w:spacing w:after="0"/>
         <w:rPr>
           <w:rFonts w:ascii="Courier New" w:hAnsi="Courier New" w:cs="Courier New"/>
           <w:b/>
           <w:bCs/>
         </w:rPr>
-        <w:t>appointment2_time = '2024-07-20 11:30 AM'</w:t>
-      </w:r>
-    </w:p>
-    <w:p>
-      <w:pPr>
-        <w:spacing w:after="0"/>
+      </w:pPr>
+      <w:r>
         <w:rPr>
           <w:rFonts w:ascii="Courier New" w:hAnsi="Courier New" w:cs="Courier New"/>
           <w:b/>
           <w:bCs/>
         </w:rPr>
-      </w:pPr>
-      <w:r>
+        <w:t>practitioner2_name = 'Dr. Jane Roe'</w:t>
+      </w:r>
+    </w:p>
+    <w:p>
+      <w:pPr>
+        <w:spacing w:after="0"/>
         <w:rPr>
           <w:rFonts w:ascii="Courier New" w:hAnsi="Courier New" w:cs="Courier New"/>
           <w:b/>
           <w:bCs/>
         </w:rPr>
-        <w:t>print(f"Patient: {patient2_name} | Practitioner: {practitioner2_name} | Time: {appointment2_time}")</w:t>
+      </w:pPr>
+      <w:r>
+        <w:rPr>
+          <w:rFonts w:ascii="Courier New" w:hAnsi="Courier New" w:cs="Courier New"/>
+          <w:b/>
+          <w:bCs/>
+        </w:rPr>
+        <w:t>appointment2_time = '2024-07-20 11:30 AM'</w:t>
+      </w:r>
+    </w:p>
+    <w:p>
+      <w:pPr>
+        <w:spacing w:after="0"/>
+        <w:rPr>
+          <w:rFonts w:ascii="Courier New" w:hAnsi="Courier New" w:cs="Courier New"/>
+          <w:b/>
+          <w:bCs/>
+        </w:rPr>
+      </w:pPr>
+      <w:proofErr w:type="gramStart"/>
+      <w:r>
+        <w:rPr>
+          <w:rFonts w:ascii="Courier New" w:hAnsi="Courier New" w:cs="Courier New"/>
+          <w:b/>
+          <w:bCs/>
+        </w:rPr>
+        <w:t>print(</w:t>
+      </w:r>
+      <w:proofErr w:type="spellStart"/>
+      <w:proofErr w:type="gramEnd"/>
+      <w:r>
+        <w:rPr>
+          <w:rFonts w:ascii="Courier New" w:hAnsi="Courier New" w:cs="Courier New"/>
+          <w:b/>
+          <w:bCs/>
+        </w:rPr>
+        <w:t>f"Patient</w:t>
+      </w:r>
+      <w:proofErr w:type="spellEnd"/>
+      <w:r>
+        <w:rPr>
+          <w:rFonts w:ascii="Courier New" w:hAnsi="Courier New" w:cs="Courier New"/>
+          <w:b/>
+          <w:bCs/>
+        </w:rPr>
+        <w:t>: {patient2_name} | Practitioner: {practitioner2_name} | Time: {appointment2_time}")</w:t>
       </w:r>
     </w:p>
     <w:p>
@@ -479,7 +561,6 @@
           <w:rFonts w:ascii="Courier New" w:hAnsi="Courier New" w:cs="Courier New"/>
           <w:b/>
           <w:bCs/>
-          <w:lang w:val="en-AU"/>
         </w:rPr>
       </w:pPr>
       <w:r>
@@ -487,7 +568,6 @@
           <w:rFonts w:ascii="Courier New" w:hAnsi="Courier New" w:cs="Courier New"/>
           <w:b/>
           <w:bCs/>
-          <w:lang w:val="en-AU"/>
         </w:rPr>
         <w:t># Use lists, dictionaries and functions to enhance the Python file</w:t>
       </w:r>
@@ -499,7 +579,6 @@
           <w:rFonts w:ascii="Courier New" w:hAnsi="Courier New" w:cs="Courier New"/>
           <w:b/>
           <w:bCs/>
-          <w:lang w:val="en-AU"/>
         </w:rPr>
       </w:pPr>
     </w:p>
@@ -510,7 +589,6 @@
           <w:rFonts w:ascii="Courier New" w:hAnsi="Courier New" w:cs="Courier New"/>
           <w:b/>
           <w:bCs/>
-          <w:lang w:val="en-AU"/>
         </w:rPr>
       </w:pPr>
       <w:r>
@@ -518,7 +596,6 @@
           <w:rFonts w:ascii="Courier New" w:hAnsi="Courier New" w:cs="Courier New"/>
           <w:b/>
           <w:bCs/>
-          <w:lang w:val="en-AU"/>
         </w:rPr>
         <w:t>appointments = []</w:t>
       </w:r>
@@ -530,7 +607,6 @@
           <w:rFonts w:ascii="Courier New" w:hAnsi="Courier New" w:cs="Courier New"/>
           <w:b/>
           <w:bCs/>
-          <w:lang w:val="en-AU"/>
         </w:rPr>
       </w:pPr>
     </w:p>
@@ -541,7 +617,6 @@
           <w:rFonts w:ascii="Courier New" w:hAnsi="Courier New" w:cs="Courier New"/>
           <w:b/>
           <w:bCs/>
-          <w:lang w:val="en-AU"/>
         </w:rPr>
       </w:pPr>
       <w:r>
@@ -549,391 +624,722 @@
           <w:rFonts w:ascii="Courier New" w:hAnsi="Courier New" w:cs="Courier New"/>
           <w:b/>
           <w:bCs/>
-          <w:lang w:val="en-AU"/>
-        </w:rPr>
-        <w:t>def book_appointment(patient_name, practitioner_name, appointment_time):</w:t>
-      </w:r>
-    </w:p>
-    <w:p>
-      <w:pPr>
-        <w:spacing w:after="0"/>
+        </w:rPr>
+        <w:t xml:space="preserve">def </w:t>
+      </w:r>
+      <w:proofErr w:type="spellStart"/>
+      <w:r>
         <w:rPr>
           <w:rFonts w:ascii="Courier New" w:hAnsi="Courier New" w:cs="Courier New"/>
           <w:b/>
           <w:bCs/>
-          <w:lang w:val="en-AU"/>
-        </w:rPr>
-      </w:pPr>
+        </w:rPr>
+        <w:t>book_</w:t>
+      </w:r>
+      <w:proofErr w:type="gramStart"/>
       <w:r>
         <w:rPr>
           <w:rFonts w:ascii="Courier New" w:hAnsi="Courier New" w:cs="Courier New"/>
           <w:b/>
           <w:bCs/>
-          <w:lang w:val="en-AU"/>
-        </w:rPr>
-        <w:t>    if not patient_name:</w:t>
-      </w:r>
-    </w:p>
-    <w:p>
-      <w:pPr>
-        <w:spacing w:after="0"/>
+        </w:rPr>
+        <w:t>appointment</w:t>
+      </w:r>
+      <w:proofErr w:type="spellEnd"/>
+      <w:r>
         <w:rPr>
           <w:rFonts w:ascii="Courier New" w:hAnsi="Courier New" w:cs="Courier New"/>
           <w:b/>
           <w:bCs/>
-          <w:lang w:val="en-AU"/>
-        </w:rPr>
-      </w:pPr>
+        </w:rPr>
+        <w:t>(</w:t>
+      </w:r>
+      <w:proofErr w:type="spellStart"/>
+      <w:proofErr w:type="gramEnd"/>
       <w:r>
         <w:rPr>
           <w:rFonts w:ascii="Courier New" w:hAnsi="Courier New" w:cs="Courier New"/>
           <w:b/>
           <w:bCs/>
-          <w:lang w:val="en-AU"/>
-        </w:rPr>
-        <w:t>        raise ValueError("Patient name cannot be empty")</w:t>
-      </w:r>
-    </w:p>
-    <w:p>
-      <w:pPr>
-        <w:spacing w:after="0"/>
+        </w:rPr>
+        <w:t>patient_name</w:t>
+      </w:r>
+      <w:proofErr w:type="spellEnd"/>
+      <w:r>
         <w:rPr>
           <w:rFonts w:ascii="Courier New" w:hAnsi="Courier New" w:cs="Courier New"/>
           <w:b/>
           <w:bCs/>
-          <w:lang w:val="en-AU"/>
-        </w:rPr>
-      </w:pPr>
+        </w:rPr>
+        <w:t xml:space="preserve">, </w:t>
+      </w:r>
+      <w:proofErr w:type="spellStart"/>
       <w:r>
         <w:rPr>
           <w:rFonts w:ascii="Courier New" w:hAnsi="Courier New" w:cs="Courier New"/>
           <w:b/>
           <w:bCs/>
-          <w:lang w:val="en-AU"/>
-        </w:rPr>
-        <w:t>    appointment = {</w:t>
-      </w:r>
-    </w:p>
-    <w:p>
-      <w:pPr>
-        <w:spacing w:after="0"/>
+        </w:rPr>
+        <w:t>practitioner_name</w:t>
+      </w:r>
+      <w:proofErr w:type="spellEnd"/>
+      <w:r>
         <w:rPr>
           <w:rFonts w:ascii="Courier New" w:hAnsi="Courier New" w:cs="Courier New"/>
           <w:b/>
           <w:bCs/>
-          <w:lang w:val="en-AU"/>
-        </w:rPr>
-      </w:pPr>
+        </w:rPr>
+        <w:t xml:space="preserve">, </w:t>
+      </w:r>
+      <w:proofErr w:type="spellStart"/>
       <w:r>
         <w:rPr>
           <w:rFonts w:ascii="Courier New" w:hAnsi="Courier New" w:cs="Courier New"/>
           <w:b/>
           <w:bCs/>
-          <w:lang w:val="en-AU"/>
-        </w:rPr>
-        <w:t>        "patient": patient_name,</w:t>
-      </w:r>
-    </w:p>
-    <w:p>
-      <w:pPr>
-        <w:spacing w:after="0"/>
+        </w:rPr>
+        <w:t>appointment_time</w:t>
+      </w:r>
+      <w:proofErr w:type="spellEnd"/>
+      <w:r>
         <w:rPr>
           <w:rFonts w:ascii="Courier New" w:hAnsi="Courier New" w:cs="Courier New"/>
           <w:b/>
           <w:bCs/>
-          <w:lang w:val="en-AU"/>
-        </w:rPr>
-      </w:pPr>
-      <w:r>
+        </w:rPr>
+        <w:t>):</w:t>
+      </w:r>
+    </w:p>
+    <w:p>
+      <w:pPr>
+        <w:spacing w:after="0"/>
         <w:rPr>
           <w:rFonts w:ascii="Courier New" w:hAnsi="Courier New" w:cs="Courier New"/>
           <w:b/>
           <w:bCs/>
-          <w:lang w:val="en-AU"/>
-        </w:rPr>
-        <w:t>        "practitioner": practitioner_name,</w:t>
-      </w:r>
-    </w:p>
-    <w:p>
-      <w:pPr>
-        <w:spacing w:after="0"/>
+        </w:rPr>
+      </w:pPr>
+      <w:r>
         <w:rPr>
           <w:rFonts w:ascii="Courier New" w:hAnsi="Courier New" w:cs="Courier New"/>
           <w:b/>
           <w:bCs/>
-          <w:lang w:val="en-AU"/>
-        </w:rPr>
-      </w:pPr>
+        </w:rPr>
+        <w:t xml:space="preserve">    if not </w:t>
+      </w:r>
+      <w:proofErr w:type="spellStart"/>
       <w:r>
         <w:rPr>
           <w:rFonts w:ascii="Courier New" w:hAnsi="Courier New" w:cs="Courier New"/>
           <w:b/>
           <w:bCs/>
-          <w:lang w:val="en-AU"/>
-        </w:rPr>
-        <w:t>        "time": appointment_time</w:t>
-      </w:r>
-    </w:p>
-    <w:p>
-      <w:pPr>
-        <w:spacing w:after="0"/>
+        </w:rPr>
+        <w:t>patient_name</w:t>
+      </w:r>
+      <w:proofErr w:type="spellEnd"/>
+      <w:r>
         <w:rPr>
           <w:rFonts w:ascii="Courier New" w:hAnsi="Courier New" w:cs="Courier New"/>
           <w:b/>
           <w:bCs/>
-          <w:lang w:val="en-AU"/>
-        </w:rPr>
-      </w:pPr>
-      <w:r>
+        </w:rPr>
+        <w:t>:</w:t>
+      </w:r>
+    </w:p>
+    <w:p>
+      <w:pPr>
+        <w:spacing w:after="0"/>
         <w:rPr>
           <w:rFonts w:ascii="Courier New" w:hAnsi="Courier New" w:cs="Courier New"/>
           <w:b/>
           <w:bCs/>
-          <w:lang w:val="en-AU"/>
-        </w:rPr>
-        <w:t>    }</w:t>
-      </w:r>
-    </w:p>
-    <w:p>
-      <w:pPr>
-        <w:spacing w:after="0"/>
+        </w:rPr>
+      </w:pPr>
+      <w:r>
         <w:rPr>
           <w:rFonts w:ascii="Courier New" w:hAnsi="Courier New" w:cs="Courier New"/>
           <w:b/>
           <w:bCs/>
-          <w:lang w:val="en-AU"/>
-        </w:rPr>
-      </w:pPr>
+        </w:rPr>
+        <w:t xml:space="preserve">        raise </w:t>
+      </w:r>
+      <w:proofErr w:type="spellStart"/>
+      <w:proofErr w:type="gramStart"/>
       <w:r>
         <w:rPr>
           <w:rFonts w:ascii="Courier New" w:hAnsi="Courier New" w:cs="Courier New"/>
           <w:b/>
           <w:bCs/>
-          <w:lang w:val="en-AU"/>
-        </w:rPr>
-        <w:t>    appointments.append(appointment)</w:t>
-      </w:r>
-    </w:p>
-    <w:p>
-      <w:pPr>
-        <w:spacing w:after="0"/>
+        </w:rPr>
+        <w:t>ValueError</w:t>
+      </w:r>
+      <w:proofErr w:type="spellEnd"/>
+      <w:r>
         <w:rPr>
           <w:rFonts w:ascii="Courier New" w:hAnsi="Courier New" w:cs="Courier New"/>
           <w:b/>
           <w:bCs/>
-          <w:lang w:val="en-AU"/>
-        </w:rPr>
-      </w:pPr>
-    </w:p>
-    <w:p>
-      <w:pPr>
-        <w:spacing w:after="0"/>
+        </w:rPr>
+        <w:t>(</w:t>
+      </w:r>
+      <w:proofErr w:type="gramEnd"/>
+      <w:r>
         <w:rPr>
           <w:rFonts w:ascii="Courier New" w:hAnsi="Courier New" w:cs="Courier New"/>
           <w:b/>
           <w:bCs/>
-          <w:lang w:val="en-AU"/>
-        </w:rPr>
-      </w:pPr>
-      <w:r>
+        </w:rPr>
+        <w:t>"Patient name cannot be empty")</w:t>
+      </w:r>
+    </w:p>
+    <w:p>
+      <w:pPr>
+        <w:spacing w:after="0"/>
         <w:rPr>
           <w:rFonts w:ascii="Courier New" w:hAnsi="Courier New" w:cs="Courier New"/>
           <w:b/>
           <w:bCs/>
-          <w:lang w:val="en-AU"/>
-        </w:rPr>
-        <w:t>def display_appointments():</w:t>
-      </w:r>
-    </w:p>
-    <w:p>
-      <w:pPr>
-        <w:spacing w:after="0"/>
+        </w:rPr>
+      </w:pPr>
+      <w:r>
         <w:rPr>
           <w:rFonts w:ascii="Courier New" w:hAnsi="Courier New" w:cs="Courier New"/>
           <w:b/>
           <w:bCs/>
-          <w:lang w:val="en-AU"/>
-        </w:rPr>
-      </w:pPr>
-      <w:r>
+        </w:rPr>
+        <w:t>    appointment = {</w:t>
+      </w:r>
+    </w:p>
+    <w:p>
+      <w:pPr>
+        <w:spacing w:after="0"/>
         <w:rPr>
           <w:rFonts w:ascii="Courier New" w:hAnsi="Courier New" w:cs="Courier New"/>
           <w:b/>
           <w:bCs/>
-          <w:lang w:val="en-AU"/>
-        </w:rPr>
-        <w:t>    if not appointments:</w:t>
-      </w:r>
-    </w:p>
-    <w:p>
-      <w:pPr>
-        <w:spacing w:after="0"/>
+        </w:rPr>
+      </w:pPr>
+      <w:r>
         <w:rPr>
           <w:rFonts w:ascii="Courier New" w:hAnsi="Courier New" w:cs="Courier New"/>
           <w:b/>
           <w:bCs/>
-          <w:lang w:val="en-AU"/>
-        </w:rPr>
-      </w:pPr>
+        </w:rPr>
+        <w:t xml:space="preserve">        "patient": </w:t>
+      </w:r>
+      <w:proofErr w:type="spellStart"/>
       <w:r>
         <w:rPr>
           <w:rFonts w:ascii="Courier New" w:hAnsi="Courier New" w:cs="Courier New"/>
           <w:b/>
           <w:bCs/>
-          <w:lang w:val="en-AU"/>
-        </w:rPr>
-        <w:t>        print("No appointments recorded.")</w:t>
-      </w:r>
-    </w:p>
-    <w:p>
-      <w:pPr>
-        <w:spacing w:after="0"/>
+        </w:rPr>
+        <w:t>patient_name</w:t>
+      </w:r>
+      <w:proofErr w:type="spellEnd"/>
+      <w:r>
         <w:rPr>
           <w:rFonts w:ascii="Courier New" w:hAnsi="Courier New" w:cs="Courier New"/>
           <w:b/>
           <w:bCs/>
-          <w:lang w:val="en-AU"/>
-        </w:rPr>
-      </w:pPr>
-      <w:r>
+        </w:rPr>
+        <w:t>,</w:t>
+      </w:r>
+    </w:p>
+    <w:p>
+      <w:pPr>
+        <w:spacing w:after="0"/>
         <w:rPr>
           <w:rFonts w:ascii="Courier New" w:hAnsi="Courier New" w:cs="Courier New"/>
           <w:b/>
           <w:bCs/>
-          <w:lang w:val="en-AU"/>
-        </w:rPr>
-        <w:t>        return</w:t>
-      </w:r>
-    </w:p>
-    <w:p>
-      <w:pPr>
-        <w:spacing w:after="0"/>
+        </w:rPr>
+      </w:pPr>
+      <w:r>
         <w:rPr>
           <w:rFonts w:ascii="Courier New" w:hAnsi="Courier New" w:cs="Courier New"/>
           <w:b/>
           <w:bCs/>
-          <w:lang w:val="en-AU"/>
-        </w:rPr>
-      </w:pPr>
+        </w:rPr>
+        <w:t xml:space="preserve">        "practitioner": </w:t>
+      </w:r>
+      <w:proofErr w:type="spellStart"/>
       <w:r>
         <w:rPr>
           <w:rFonts w:ascii="Courier New" w:hAnsi="Courier New" w:cs="Courier New"/>
           <w:b/>
           <w:bCs/>
-          <w:lang w:val="en-AU"/>
-        </w:rPr>
-        <w:t>    for appointment in appointments:</w:t>
-      </w:r>
-    </w:p>
-    <w:p>
-      <w:pPr>
-        <w:spacing w:after="0"/>
+        </w:rPr>
+        <w:t>practitioner_name</w:t>
+      </w:r>
+      <w:proofErr w:type="spellEnd"/>
+      <w:r>
         <w:rPr>
           <w:rFonts w:ascii="Courier New" w:hAnsi="Courier New" w:cs="Courier New"/>
           <w:b/>
           <w:bCs/>
-          <w:lang w:val="en-AU"/>
-        </w:rPr>
-      </w:pPr>
-      <w:r>
+        </w:rPr>
+        <w:t>,</w:t>
+      </w:r>
+    </w:p>
+    <w:p>
+      <w:pPr>
+        <w:spacing w:after="0"/>
         <w:rPr>
           <w:rFonts w:ascii="Courier New" w:hAnsi="Courier New" w:cs="Courier New"/>
           <w:b/>
           <w:bCs/>
-          <w:lang w:val="en-AU"/>
-        </w:rPr>
-        <w:t>        print(f"Patient: {appointment['patient']} | Practitioner: {appointment['practitioner']} | Time: {appointment['time']}")</w:t>
-      </w:r>
-    </w:p>
-    <w:p>
-      <w:pPr>
-        <w:spacing w:after="0"/>
+        </w:rPr>
+      </w:pPr>
+      <w:r>
         <w:rPr>
           <w:rFonts w:ascii="Courier New" w:hAnsi="Courier New" w:cs="Courier New"/>
           <w:b/>
           <w:bCs/>
-          <w:lang w:val="en-AU"/>
-        </w:rPr>
-      </w:pPr>
-    </w:p>
-    <w:p>
-      <w:pPr>
-        <w:spacing w:after="0"/>
+        </w:rPr>
+        <w:t xml:space="preserve">        "time": </w:t>
+      </w:r>
+      <w:proofErr w:type="spellStart"/>
+      <w:r>
         <w:rPr>
           <w:rFonts w:ascii="Courier New" w:hAnsi="Courier New" w:cs="Courier New"/>
           <w:b/>
           <w:bCs/>
-          <w:lang w:val="en-AU"/>
-        </w:rPr>
-      </w:pPr>
-      <w:r>
+        </w:rPr>
+        <w:t>appointment_time</w:t>
+      </w:r>
+      <w:proofErr w:type="spellEnd"/>
+    </w:p>
+    <w:p>
+      <w:pPr>
+        <w:spacing w:after="0"/>
         <w:rPr>
           <w:rFonts w:ascii="Courier New" w:hAnsi="Courier New" w:cs="Courier New"/>
           <w:b/>
           <w:bCs/>
-          <w:lang w:val="en-AU"/>
-        </w:rPr>
-        <w:t>print("Welcome to SmartCare: The Clinical Appointment Booking System!")</w:t>
-      </w:r>
-    </w:p>
-    <w:p>
-      <w:pPr>
-        <w:spacing w:after="0"/>
+        </w:rPr>
+      </w:pPr>
+      <w:r>
         <w:rPr>
           <w:rFonts w:ascii="Courier New" w:hAnsi="Courier New" w:cs="Courier New"/>
           <w:b/>
           <w:bCs/>
-          <w:lang w:val="en-AU"/>
-        </w:rPr>
-      </w:pPr>
-      <w:r>
+        </w:rPr>
+        <w:t>    }</w:t>
+      </w:r>
+    </w:p>
+    <w:p>
+      <w:pPr>
+        <w:spacing w:after="0"/>
         <w:rPr>
           <w:rFonts w:ascii="Courier New" w:hAnsi="Courier New" w:cs="Courier New"/>
           <w:b/>
           <w:bCs/>
-          <w:lang w:val="en-AU"/>
-        </w:rPr>
-        <w:t>book_appointment('Alice Smith', 'Dr. John Doe', '2024-07-20 10:00 AM')</w:t>
-      </w:r>
-    </w:p>
-    <w:p>
-      <w:pPr>
-        <w:spacing w:after="0"/>
+        </w:rPr>
+      </w:pPr>
+      <w:r>
         <w:rPr>
           <w:rFonts w:ascii="Courier New" w:hAnsi="Courier New" w:cs="Courier New"/>
           <w:b/>
           <w:bCs/>
-          <w:lang w:val="en-AU"/>
-        </w:rPr>
-      </w:pPr>
+        </w:rPr>
+        <w:t xml:space="preserve">    </w:t>
+      </w:r>
+      <w:proofErr w:type="spellStart"/>
+      <w:proofErr w:type="gramStart"/>
       <w:r>
         <w:rPr>
           <w:rFonts w:ascii="Courier New" w:hAnsi="Courier New" w:cs="Courier New"/>
           <w:b/>
           <w:bCs/>
-          <w:lang w:val="en-AU"/>
-        </w:rPr>
-        <w:t>book_appointment('Bob Johnson', 'Dr. Jane Roe', '2024-07-20 11:30 AM')</w:t>
-      </w:r>
-    </w:p>
-    <w:p>
-      <w:pPr>
-        <w:spacing w:after="0"/>
+        </w:rPr>
+        <w:t>appointments.append</w:t>
+      </w:r>
+      <w:proofErr w:type="spellEnd"/>
+      <w:proofErr w:type="gramEnd"/>
+      <w:r>
         <w:rPr>
           <w:rFonts w:ascii="Courier New" w:hAnsi="Courier New" w:cs="Courier New"/>
           <w:b/>
           <w:bCs/>
-          <w:lang w:val="en-AU"/>
-        </w:rPr>
-      </w:pPr>
-      <w:r>
+        </w:rPr>
+        <w:t>(appointment)</w:t>
+      </w:r>
+    </w:p>
+    <w:p>
+      <w:pPr>
+        <w:spacing w:after="0"/>
         <w:rPr>
           <w:rFonts w:ascii="Courier New" w:hAnsi="Courier New" w:cs="Courier New"/>
           <w:b/>
           <w:bCs/>
-          <w:lang w:val="en-AU"/>
-        </w:rPr>
-        <w:t>display_appointments()</w:t>
+        </w:rPr>
+      </w:pPr>
+    </w:p>
+    <w:p>
+      <w:pPr>
+        <w:spacing w:after="0"/>
+        <w:rPr>
+          <w:rFonts w:ascii="Courier New" w:hAnsi="Courier New" w:cs="Courier New"/>
+          <w:b/>
+          <w:bCs/>
+        </w:rPr>
+      </w:pPr>
+      <w:r>
+        <w:rPr>
+          <w:rFonts w:ascii="Courier New" w:hAnsi="Courier New" w:cs="Courier New"/>
+          <w:b/>
+          <w:bCs/>
+        </w:rPr>
+        <w:t xml:space="preserve">def </w:t>
+      </w:r>
+      <w:proofErr w:type="spellStart"/>
+      <w:r>
+        <w:rPr>
+          <w:rFonts w:ascii="Courier New" w:hAnsi="Courier New" w:cs="Courier New"/>
+          <w:b/>
+          <w:bCs/>
+        </w:rPr>
+        <w:t>display_</w:t>
+      </w:r>
+      <w:proofErr w:type="gramStart"/>
+      <w:r>
+        <w:rPr>
+          <w:rFonts w:ascii="Courier New" w:hAnsi="Courier New" w:cs="Courier New"/>
+          <w:b/>
+          <w:bCs/>
+        </w:rPr>
+        <w:t>appointments</w:t>
+      </w:r>
+      <w:proofErr w:type="spellEnd"/>
+      <w:r>
+        <w:rPr>
+          <w:rFonts w:ascii="Courier New" w:hAnsi="Courier New" w:cs="Courier New"/>
+          <w:b/>
+          <w:bCs/>
+        </w:rPr>
+        <w:t>(</w:t>
+      </w:r>
+      <w:proofErr w:type="gramEnd"/>
+      <w:r>
+        <w:rPr>
+          <w:rFonts w:ascii="Courier New" w:hAnsi="Courier New" w:cs="Courier New"/>
+          <w:b/>
+          <w:bCs/>
+        </w:rPr>
+        <w:t>):</w:t>
+      </w:r>
+    </w:p>
+    <w:p>
+      <w:pPr>
+        <w:spacing w:after="0"/>
+        <w:rPr>
+          <w:rFonts w:ascii="Courier New" w:hAnsi="Courier New" w:cs="Courier New"/>
+          <w:b/>
+          <w:bCs/>
+        </w:rPr>
+      </w:pPr>
+      <w:r>
+        <w:rPr>
+          <w:rFonts w:ascii="Courier New" w:hAnsi="Courier New" w:cs="Courier New"/>
+          <w:b/>
+          <w:bCs/>
+        </w:rPr>
+        <w:t>    if not appointments:</w:t>
+      </w:r>
+    </w:p>
+    <w:p>
+      <w:pPr>
+        <w:spacing w:after="0"/>
+        <w:rPr>
+          <w:rFonts w:ascii="Courier New" w:hAnsi="Courier New" w:cs="Courier New"/>
+          <w:b/>
+          <w:bCs/>
+        </w:rPr>
+      </w:pPr>
+      <w:r>
+        <w:rPr>
+          <w:rFonts w:ascii="Courier New" w:hAnsi="Courier New" w:cs="Courier New"/>
+          <w:b/>
+          <w:bCs/>
+        </w:rPr>
+        <w:t xml:space="preserve">        </w:t>
+      </w:r>
+      <w:proofErr w:type="gramStart"/>
+      <w:r>
+        <w:rPr>
+          <w:rFonts w:ascii="Courier New" w:hAnsi="Courier New" w:cs="Courier New"/>
+          <w:b/>
+          <w:bCs/>
+        </w:rPr>
+        <w:t>print(</w:t>
+      </w:r>
+      <w:proofErr w:type="gramEnd"/>
+      <w:r>
+        <w:rPr>
+          <w:rFonts w:ascii="Courier New" w:hAnsi="Courier New" w:cs="Courier New"/>
+          <w:b/>
+          <w:bCs/>
+        </w:rPr>
+        <w:t>"No appointments recorded.")</w:t>
+      </w:r>
+    </w:p>
+    <w:p>
+      <w:pPr>
+        <w:spacing w:after="0"/>
+        <w:rPr>
+          <w:rFonts w:ascii="Courier New" w:hAnsi="Courier New" w:cs="Courier New"/>
+          <w:b/>
+          <w:bCs/>
+        </w:rPr>
+      </w:pPr>
+      <w:r>
+        <w:rPr>
+          <w:rFonts w:ascii="Courier New" w:hAnsi="Courier New" w:cs="Courier New"/>
+          <w:b/>
+          <w:bCs/>
+        </w:rPr>
+        <w:t>        return</w:t>
+      </w:r>
+    </w:p>
+    <w:p>
+      <w:pPr>
+        <w:spacing w:after="0"/>
+        <w:rPr>
+          <w:rFonts w:ascii="Courier New" w:hAnsi="Courier New" w:cs="Courier New"/>
+          <w:b/>
+          <w:bCs/>
+        </w:rPr>
+      </w:pPr>
+      <w:r>
+        <w:rPr>
+          <w:rFonts w:ascii="Courier New" w:hAnsi="Courier New" w:cs="Courier New"/>
+          <w:b/>
+          <w:bCs/>
+        </w:rPr>
+        <w:t>    for appointment in appointments:</w:t>
+      </w:r>
+    </w:p>
+    <w:p>
+      <w:pPr>
+        <w:spacing w:after="0"/>
+        <w:rPr>
+          <w:rFonts w:ascii="Courier New" w:hAnsi="Courier New" w:cs="Courier New"/>
+          <w:b/>
+          <w:bCs/>
+        </w:rPr>
+      </w:pPr>
+      <w:r>
+        <w:rPr>
+          <w:rFonts w:ascii="Courier New" w:hAnsi="Courier New" w:cs="Courier New"/>
+          <w:b/>
+          <w:bCs/>
+        </w:rPr>
+        <w:t xml:space="preserve">        </w:t>
+      </w:r>
+      <w:proofErr w:type="gramStart"/>
+      <w:r>
+        <w:rPr>
+          <w:rFonts w:ascii="Courier New" w:hAnsi="Courier New" w:cs="Courier New"/>
+          <w:b/>
+          <w:bCs/>
+        </w:rPr>
+        <w:t>print(</w:t>
+      </w:r>
+      <w:proofErr w:type="spellStart"/>
+      <w:proofErr w:type="gramEnd"/>
+      <w:r>
+        <w:rPr>
+          <w:rFonts w:ascii="Courier New" w:hAnsi="Courier New" w:cs="Courier New"/>
+          <w:b/>
+          <w:bCs/>
+        </w:rPr>
+        <w:t>f"Patient</w:t>
+      </w:r>
+      <w:proofErr w:type="spellEnd"/>
+      <w:r>
+        <w:rPr>
+          <w:rFonts w:ascii="Courier New" w:hAnsi="Courier New" w:cs="Courier New"/>
+          <w:b/>
+          <w:bCs/>
+        </w:rPr>
+        <w:t>: {appointment['patient']} | Practitioner: {appointment['practitioner']} | Time: {appointment['time']}")</w:t>
+      </w:r>
+    </w:p>
+    <w:p>
+      <w:pPr>
+        <w:spacing w:after="0"/>
+        <w:rPr>
+          <w:rFonts w:ascii="Courier New" w:hAnsi="Courier New" w:cs="Courier New"/>
+          <w:b/>
+          <w:bCs/>
+        </w:rPr>
+      </w:pPr>
+    </w:p>
+    <w:p>
+      <w:pPr>
+        <w:spacing w:after="0"/>
+        <w:rPr>
+          <w:rFonts w:ascii="Courier New" w:hAnsi="Courier New" w:cs="Courier New"/>
+          <w:b/>
+          <w:bCs/>
+        </w:rPr>
+      </w:pPr>
+      <w:proofErr w:type="gramStart"/>
+      <w:r>
+        <w:rPr>
+          <w:rFonts w:ascii="Courier New" w:hAnsi="Courier New" w:cs="Courier New"/>
+          <w:b/>
+          <w:bCs/>
+        </w:rPr>
+        <w:t>print(</w:t>
+      </w:r>
+      <w:proofErr w:type="gramEnd"/>
+      <w:r>
+        <w:rPr>
+          <w:rFonts w:ascii="Courier New" w:hAnsi="Courier New" w:cs="Courier New"/>
+          <w:b/>
+          <w:bCs/>
+        </w:rPr>
+        <w:t>"Welcome to SmartCare: The Clinical Appointment Booking System!")</w:t>
+      </w:r>
+    </w:p>
+    <w:p>
+      <w:pPr>
+        <w:spacing w:after="0"/>
+        <w:rPr>
+          <w:rFonts w:ascii="Courier New" w:hAnsi="Courier New" w:cs="Courier New"/>
+          <w:b/>
+          <w:bCs/>
+        </w:rPr>
+      </w:pPr>
+      <w:proofErr w:type="spellStart"/>
+      <w:r>
+        <w:rPr>
+          <w:rFonts w:ascii="Courier New" w:hAnsi="Courier New" w:cs="Courier New"/>
+          <w:b/>
+          <w:bCs/>
+        </w:rPr>
+        <w:t>book_</w:t>
+      </w:r>
+      <w:proofErr w:type="gramStart"/>
+      <w:r>
+        <w:rPr>
+          <w:rFonts w:ascii="Courier New" w:hAnsi="Courier New" w:cs="Courier New"/>
+          <w:b/>
+          <w:bCs/>
+        </w:rPr>
+        <w:t>appointment</w:t>
+      </w:r>
+      <w:proofErr w:type="spellEnd"/>
+      <w:r>
+        <w:rPr>
+          <w:rFonts w:ascii="Courier New" w:hAnsi="Courier New" w:cs="Courier New"/>
+          <w:b/>
+          <w:bCs/>
+        </w:rPr>
+        <w:t>(</w:t>
+      </w:r>
+      <w:proofErr w:type="gramEnd"/>
+      <w:r>
+        <w:rPr>
+          <w:rFonts w:ascii="Courier New" w:hAnsi="Courier New" w:cs="Courier New"/>
+          <w:b/>
+          <w:bCs/>
+        </w:rPr>
+        <w:t>'Alice Smith', 'Dr. John Doe', '2024-07-20 10:00 AM')</w:t>
+      </w:r>
+    </w:p>
+    <w:p>
+      <w:pPr>
+        <w:spacing w:after="0"/>
+        <w:rPr>
+          <w:rFonts w:ascii="Courier New" w:hAnsi="Courier New" w:cs="Courier New"/>
+          <w:b/>
+          <w:bCs/>
+        </w:rPr>
+      </w:pPr>
+      <w:proofErr w:type="spellStart"/>
+      <w:r>
+        <w:rPr>
+          <w:rFonts w:ascii="Courier New" w:hAnsi="Courier New" w:cs="Courier New"/>
+          <w:b/>
+          <w:bCs/>
+        </w:rPr>
+        <w:t>book_</w:t>
+      </w:r>
+      <w:proofErr w:type="gramStart"/>
+      <w:r>
+        <w:rPr>
+          <w:rFonts w:ascii="Courier New" w:hAnsi="Courier New" w:cs="Courier New"/>
+          <w:b/>
+          <w:bCs/>
+        </w:rPr>
+        <w:t>appointment</w:t>
+      </w:r>
+      <w:proofErr w:type="spellEnd"/>
+      <w:r>
+        <w:rPr>
+          <w:rFonts w:ascii="Courier New" w:hAnsi="Courier New" w:cs="Courier New"/>
+          <w:b/>
+          <w:bCs/>
+        </w:rPr>
+        <w:t>(</w:t>
+      </w:r>
+      <w:proofErr w:type="gramEnd"/>
+      <w:r>
+        <w:rPr>
+          <w:rFonts w:ascii="Courier New" w:hAnsi="Courier New" w:cs="Courier New"/>
+          <w:b/>
+          <w:bCs/>
+        </w:rPr>
+        <w:t>'Bob Johnson', 'Dr. Jane Roe', '2024-07-20 11:30 AM')</w:t>
+      </w:r>
+    </w:p>
+    <w:p>
+      <w:pPr>
+        <w:spacing w:after="0"/>
+        <w:rPr>
+          <w:rFonts w:ascii="Courier New" w:hAnsi="Courier New" w:cs="Courier New"/>
+          <w:b/>
+          <w:bCs/>
+        </w:rPr>
+      </w:pPr>
+      <w:proofErr w:type="spellStart"/>
+      <w:r>
+        <w:rPr>
+          <w:rFonts w:ascii="Courier New" w:hAnsi="Courier New" w:cs="Courier New"/>
+          <w:b/>
+          <w:bCs/>
+        </w:rPr>
+        <w:t>display_</w:t>
+      </w:r>
+      <w:proofErr w:type="gramStart"/>
+      <w:r>
+        <w:rPr>
+          <w:rFonts w:ascii="Courier New" w:hAnsi="Courier New" w:cs="Courier New"/>
+          <w:b/>
+          <w:bCs/>
+        </w:rPr>
+        <w:t>appointments</w:t>
+      </w:r>
+      <w:proofErr w:type="spellEnd"/>
+      <w:r>
+        <w:rPr>
+          <w:rFonts w:ascii="Courier New" w:hAnsi="Courier New" w:cs="Courier New"/>
+          <w:b/>
+          <w:bCs/>
+        </w:rPr>
+        <w:t>(</w:t>
+      </w:r>
+      <w:proofErr w:type="gramEnd"/>
+      <w:r>
+        <w:rPr>
+          <w:rFonts w:ascii="Courier New" w:hAnsi="Courier New" w:cs="Courier New"/>
+          <w:b/>
+          <w:bCs/>
+        </w:rPr>
+        <w:t>)</w:t>
       </w:r>
     </w:p>
     <w:p/>
@@ -947,7 +1353,35 @@
         <w:rPr>
           <w:color w:val="C00000"/>
         </w:rPr>
-        <w:t>^ Now, run  both programs , and identify at least five limitations.</w:t>
+        <w:t xml:space="preserve">^ Now, </w:t>
+      </w:r>
+      <w:proofErr w:type="gramStart"/>
+      <w:r>
+        <w:rPr>
+          <w:color w:val="C00000"/>
+        </w:rPr>
+        <w:t>run  both</w:t>
+      </w:r>
+      <w:proofErr w:type="gramEnd"/>
+      <w:r>
+        <w:rPr>
+          <w:color w:val="C00000"/>
+        </w:rPr>
+        <w:t xml:space="preserve"> </w:t>
+      </w:r>
+      <w:proofErr w:type="gramStart"/>
+      <w:r>
+        <w:rPr>
+          <w:color w:val="C00000"/>
+        </w:rPr>
+        <w:t>programs ,</w:t>
+      </w:r>
+      <w:proofErr w:type="gramEnd"/>
+      <w:r>
+        <w:rPr>
+          <w:color w:val="C00000"/>
+        </w:rPr>
+        <w:t xml:space="preserve"> and identify at least five limitations.</w:t>
       </w:r>
     </w:p>
     <w:p>
@@ -959,10 +1393,145 @@
     </w:p>
     <w:p>
       <w:pPr>
+        <w:rPr>
+          <w:color w:val="C00000"/>
+        </w:rPr>
+      </w:pPr>
+    </w:p>
+    <w:p>
+      <w:pPr>
+        <w:rPr>
+          <w:color w:val="31849B" w:themeColor="accent5" w:themeShade="BF"/>
+        </w:rPr>
+      </w:pPr>
+      <w:r>
+        <w:rPr>
+          <w:color w:val="31849B" w:themeColor="accent5" w:themeShade="BF"/>
+        </w:rPr>
+        <w:lastRenderedPageBreak/>
+        <w:t>Identified Limitations with the Programs:</w:t>
+      </w:r>
+    </w:p>
+    <w:p>
+      <w:pPr>
+        <w:pStyle w:val="ListParagraph"/>
+        <w:numPr>
+          <w:ilvl w:val="0"/>
+          <w:numId w:val="10"/>
+        </w:numPr>
+        <w:rPr>
+          <w:color w:val="31849B" w:themeColor="accent5" w:themeShade="BF"/>
+        </w:rPr>
+      </w:pPr>
+      <w:r>
+        <w:rPr>
+          <w:color w:val="31849B" w:themeColor="accent5" w:themeShade="BF"/>
+        </w:rPr>
+        <w:t>Both programs store the information about patients in volatile memory (RAM) and therefore any data is lost. Ideally the data should be saved to an external file.</w:t>
+      </w:r>
+    </w:p>
+    <w:p>
+      <w:pPr>
+        <w:pStyle w:val="ListParagraph"/>
+        <w:numPr>
+          <w:ilvl w:val="0"/>
+          <w:numId w:val="10"/>
+        </w:numPr>
+        <w:rPr>
+          <w:color w:val="31849B" w:themeColor="accent5" w:themeShade="BF"/>
+        </w:rPr>
+      </w:pPr>
+      <w:r>
+        <w:rPr>
+          <w:color w:val="31849B" w:themeColor="accent5" w:themeShade="BF"/>
+        </w:rPr>
+        <w:t>Both programs cannot detect clashes with booking or even repeated booking.</w:t>
+      </w:r>
+    </w:p>
+    <w:p>
+      <w:pPr>
+        <w:pStyle w:val="ListParagraph"/>
+        <w:numPr>
+          <w:ilvl w:val="0"/>
+          <w:numId w:val="10"/>
+        </w:numPr>
+        <w:rPr>
+          <w:color w:val="31849B" w:themeColor="accent5" w:themeShade="BF"/>
+        </w:rPr>
+      </w:pPr>
+      <w:r>
+        <w:rPr>
+          <w:color w:val="31849B" w:themeColor="accent5" w:themeShade="BF"/>
+        </w:rPr>
+        <w:t>Both programs do not check the data that has been given; especially in parsing the relevant information.</w:t>
+      </w:r>
+    </w:p>
+    <w:p>
+      <w:pPr>
+        <w:pStyle w:val="ListParagraph"/>
+        <w:numPr>
+          <w:ilvl w:val="0"/>
+          <w:numId w:val="10"/>
+        </w:numPr>
+        <w:rPr>
+          <w:color w:val="31849B" w:themeColor="accent5" w:themeShade="BF"/>
+        </w:rPr>
+      </w:pPr>
+      <w:r>
+        <w:rPr>
+          <w:color w:val="31849B" w:themeColor="accent5" w:themeShade="BF"/>
+        </w:rPr>
+        <w:t>Both programs lack a UI to allow different actions like reading the data, data input or data modification.</w:t>
+      </w:r>
+    </w:p>
+    <w:p>
+      <w:pPr>
+        <w:pStyle w:val="ListParagraph"/>
+        <w:numPr>
+          <w:ilvl w:val="0"/>
+          <w:numId w:val="10"/>
+        </w:numPr>
+        <w:rPr>
+          <w:color w:val="31849B" w:themeColor="accent5" w:themeShade="BF"/>
+        </w:rPr>
+      </w:pPr>
+      <w:r>
+        <w:rPr>
+          <w:color w:val="31849B" w:themeColor="accent5" w:themeShade="BF"/>
+        </w:rPr>
+        <w:t>Both programs have no unique identifier for patients or practitioners or even appointments, possibly leading to errors.</w:t>
+      </w:r>
+    </w:p>
+    <w:p>
+      <w:pPr>
+        <w:pStyle w:val="ListParagraph"/>
+        <w:numPr>
+          <w:ilvl w:val="0"/>
+          <w:numId w:val="10"/>
+        </w:numPr>
+        <w:rPr>
+          <w:color w:val="31849B" w:themeColor="accent5" w:themeShade="BF"/>
+        </w:rPr>
+      </w:pPr>
+      <w:r>
+        <w:rPr>
+          <w:color w:val="31849B" w:themeColor="accent5" w:themeShade="BF"/>
+        </w:rPr>
+        <w:t>Both programs are hard-coded, which means all the information is pre-defined and the statements are pre-defined, such that the program could not be used under a variety of different circumstances.</w:t>
+      </w:r>
+    </w:p>
+    <w:p>
+      <w:pPr>
+        <w:rPr>
+          <w:color w:val="C00000"/>
+        </w:rPr>
+      </w:pPr>
+    </w:p>
+    <w:p>
+      <w:pPr>
         <w:pStyle w:val="Heading1"/>
       </w:pPr>
       <w:r>
-        <w:lastRenderedPageBreak/>
         <w:t>Part C - Use AI as Tutor: AI ON</w:t>
       </w:r>
       <w:r>
@@ -1271,6 +1840,7 @@
         <w:pStyle w:val="ListBullet"/>
       </w:pPr>
       <w:r>
+        <w:lastRenderedPageBreak/>
         <w:t>Two appointments for the same practitioner/time</w:t>
       </w:r>
     </w:p>
@@ -1279,7 +1849,23 @@
         <w:pStyle w:val="ListBullet"/>
       </w:pPr>
       <w:r>
-        <w:t>Strange input such as patient_name=None or appointment_time=None</w:t>
+        <w:t xml:space="preserve">Strange input such as </w:t>
+      </w:r>
+      <w:proofErr w:type="spellStart"/>
+      <w:r>
+        <w:t>patient_name</w:t>
+      </w:r>
+      <w:proofErr w:type="spellEnd"/>
+      <w:r>
+        <w:t xml:space="preserve">=None or </w:t>
+      </w:r>
+      <w:proofErr w:type="spellStart"/>
+      <w:r>
+        <w:t>appointment_time</w:t>
+      </w:r>
+      <w:proofErr w:type="spellEnd"/>
+      <w:r>
+        <w:t>=None</w:t>
       </w:r>
     </w:p>
     <w:p>
@@ -1292,7 +1878,28 @@
     </w:p>
     <w:p>
       <w:r>
-        <w:t>Choose exactly one controlled improvement, for example: if not patient_name: raise ValueError("Patient name cannot be empty")</w:t>
+        <w:t xml:space="preserve">Choose exactly one controlled improvement, for example: if not </w:t>
+      </w:r>
+      <w:proofErr w:type="spellStart"/>
+      <w:r>
+        <w:t>patient_name</w:t>
+      </w:r>
+      <w:proofErr w:type="spellEnd"/>
+      <w:r>
+        <w:t xml:space="preserve">: raise </w:t>
+      </w:r>
+      <w:proofErr w:type="spellStart"/>
+      <w:proofErr w:type="gramStart"/>
+      <w:r>
+        <w:t>ValueError</w:t>
+      </w:r>
+      <w:proofErr w:type="spellEnd"/>
+      <w:r>
+        <w:t>(</w:t>
+      </w:r>
+      <w:proofErr w:type="gramEnd"/>
+      <w:r>
+        <w:t>"Patient name cannot be empty")</w:t>
       </w:r>
     </w:p>
     <w:p>
@@ -1320,7 +1927,6 @@
     </w:p>
     <w:p>
       <w:r>
-        <w:lastRenderedPageBreak/>
         <w:t>How did you verify the AI output?</w:t>
       </w:r>
     </w:p>
@@ -1399,7 +2005,7 @@
 </file>
 
 <file path=word/numbering.xml><?xml version="1.0" encoding="utf-8"?>
-<w:numbering xmlns:wpc="http://schemas.microsoft.com/office/word/2010/wordprocessingCanvas" xmlns:cx="http://schemas.microsoft.com/office/drawing/2014/chartex" xmlns:cx1="http://schemas.microsoft.com/office/drawing/2015/9/8/chartex" xmlns:cx2="http://schemas.microsoft.com/office/drawing/2015/10/21/chartex" xmlns:cx3="http://schemas.microsoft.com/office/drawing/2016/5/9/chartex" xmlns:cx4="http://schemas.microsoft.com/office/drawing/2016/5/10/chartex" xmlns:cx5="http://schemas.microsoft.com/office/drawing/2016/5/11/chartex" xmlns:cx6="http://schemas.microsoft.com/office/drawing/2016/5/12/chartex" xmlns:cx7="http://schemas.microsoft.com/office/drawing/2016/5/13/chartex" xmlns:cx8="http://schemas.microsoft.com/office/drawing/2016/5/14/chartex" xmlns:mc="http://schemas.openxmlformats.org/markup-compatibility/2006" xmlns:aink="http://schemas.microsoft.com/office/drawing/2016/ink" xmlns:am3d="http://schemas.microsoft.com/office/drawing/2017/model3d" xmlns:o="urn:schemas-microsoft-com:office:office" xmlns:oel="http://schemas.microsoft.com/office/2019/extlst" xmlns:r="http://schemas.openxmlformats.org/officeDocument/2006/relationships" xmlns:m="http://schemas.openxmlformats.org/officeDocument/2006/math" xmlns:v="urn:schemas-microsoft-com:vml" xmlns:wp14="http://schemas.microsoft.com/office/word/2010/wordprocessingDrawing" xmlns:wp="http://schemas.openxmlformats.org/drawingml/2006/wordprocessingDrawing" xmlns:w10="urn:schemas-microsoft-com:office:word" xmlns:w="http://schemas.openxmlformats.org/wordprocessingml/2006/main" xmlns:w14="http://schemas.microsoft.com/office/word/2010/wordml" xmlns:w15="http://schemas.microsoft.com/office/word/2012/wordml" xmlns:w16cei="http://schemas.microsoft.com/office/word/2026/wordml/cei" xmlns:w16cex="http://schemas.microsoft.com/office/word/2018/wordml/cex" xmlns:w16cid="http://schemas.microsoft.com/office/word/2016/wordml/cid" xmlns:w16="http://schemas.microsoft.com/office/word/2018/wordml" xmlns:w16du="http://schemas.microsoft.com/office/word/2023/wordml/word16du" xmlns:w16sdtdh="http://schemas.microsoft.com/office/word/2020/wordml/sdtdatahash" xmlns:w16sdtfl="http://schemas.microsoft.com/office/word/2024/wordml/sdtformatlock" xmlns:w16se="http://schemas.microsoft.com/office/word/2015/wordml/symex" xmlns:wpg="http://schemas.microsoft.com/office/word/2010/wordprocessingGroup" xmlns:wpi="http://schemas.microsoft.com/office/word/2010/wordprocessingInk" xmlns:wne="http://schemas.microsoft.com/office/word/2006/wordml" xmlns:wps="http://schemas.microsoft.com/office/word/2010/wordprocessingShape" mc:Ignorable="w14 w15 w16se w16cid w16 w16cex w16sdtdh w16sdtfl w16du wp14">
+<w:numbering xmlns:wpc="http://schemas.microsoft.com/office/word/2010/wordprocessingCanvas" xmlns:cx="http://schemas.microsoft.com/office/drawing/2014/chartex" xmlns:cx1="http://schemas.microsoft.com/office/drawing/2015/9/8/chartex" xmlns:cx2="http://schemas.microsoft.com/office/drawing/2015/10/21/chartex" xmlns:cx3="http://schemas.microsoft.com/office/drawing/2016/5/9/chartex" xmlns:cx4="http://schemas.microsoft.com/office/drawing/2016/5/10/chartex" xmlns:cx5="http://schemas.microsoft.com/office/drawing/2016/5/11/chartex" xmlns:cx6="http://schemas.microsoft.com/office/drawing/2016/5/12/chartex" xmlns:cx7="http://schemas.microsoft.com/office/drawing/2016/5/13/chartex" xmlns:cx8="http://schemas.microsoft.com/office/drawing/2016/5/14/chartex" xmlns:mc="http://schemas.openxmlformats.org/markup-compatibility/2006" xmlns:aink="http://schemas.microsoft.com/office/drawing/2016/ink" xmlns:am3d="http://schemas.microsoft.com/office/drawing/2017/model3d" xmlns:o="urn:schemas-microsoft-com:office:office" xmlns:oel="http://schemas.microsoft.com/office/2019/extlst" xmlns:r="http://schemas.openxmlformats.org/officeDocument/2006/relationships" xmlns:m="http://schemas.openxmlformats.org/officeDocument/2006/math" xmlns:v="urn:schemas-microsoft-com:vml" xmlns:wp14="http://schemas.microsoft.com/office/word/2010/wordprocessingDrawing" xmlns:wp="http://schemas.openxmlformats.org/drawingml/2006/wordprocessingDrawing" xmlns:w10="urn:schemas-microsoft-com:office:word" xmlns:w="http://schemas.openxmlformats.org/wordprocessingml/2006/main" xmlns:w14="http://schemas.microsoft.com/office/word/2010/wordml" xmlns:w15="http://schemas.microsoft.com/office/word/2012/wordml" xmlns:w16cex="http://schemas.microsoft.com/office/word/2018/wordml/cex" xmlns:w16cid="http://schemas.microsoft.com/office/word/2016/wordml/cid" xmlns:w16="http://schemas.microsoft.com/office/word/2018/wordml" xmlns:w16du="http://schemas.microsoft.com/office/word/2023/wordml/word16du" xmlns:w16sdtdh="http://schemas.microsoft.com/office/word/2020/wordml/sdtdatahash" xmlns:w16sdtfl="http://schemas.microsoft.com/office/word/2024/wordml/sdtformatlock" xmlns:w16se="http://schemas.microsoft.com/office/word/2015/wordml/symex" xmlns:wpg="http://schemas.microsoft.com/office/word/2010/wordprocessingGroup" xmlns:wpi="http://schemas.microsoft.com/office/word/2010/wordprocessingInk" xmlns:wne="http://schemas.microsoft.com/office/word/2006/wordml" xmlns:wps="http://schemas.microsoft.com/office/word/2010/wordprocessingShape" mc:Ignorable="w14 w15 w16se w16cid w16 w16cex w16sdtdh w16sdtfl w16du wp14">
   <w:abstractNum w:abstractNumId="0" w15:restartNumberingAfterBreak="0">
     <w:nsid w:val="FFFFFF7C"/>
     <w:multiLevelType w:val="singleLevel"/>
@@ -1568,6 +2174,119 @@
       </w:pPr>
       <w:rPr>
         <w:rFonts w:ascii="Symbol" w:hAnsi="Symbol" w:hint="default"/>
+      </w:rPr>
+    </w:lvl>
+  </w:abstractNum>
+  <w:abstractNum w:abstractNumId="9" w15:restartNumberingAfterBreak="0">
+    <w:nsid w:val="74FA6BDC"/>
+    <w:multiLevelType w:val="hybridMultilevel"/>
+    <w:tmpl w:val="622CCB38"/>
+    <w:lvl w:ilvl="0" w:tplc="0C090001">
+      <w:start w:val="1"/>
+      <w:numFmt w:val="bullet"/>
+      <w:lvlText w:val=""/>
+      <w:lvlJc w:val="left"/>
+      <w:pPr>
+        <w:ind w:left="720" w:hanging="360"/>
+      </w:pPr>
+      <w:rPr>
+        <w:rFonts w:ascii="Symbol" w:hAnsi="Symbol" w:hint="default"/>
+      </w:rPr>
+    </w:lvl>
+    <w:lvl w:ilvl="1" w:tplc="0C090003" w:tentative="1">
+      <w:start w:val="1"/>
+      <w:numFmt w:val="bullet"/>
+      <w:lvlText w:val="o"/>
+      <w:lvlJc w:val="left"/>
+      <w:pPr>
+        <w:ind w:left="1440" w:hanging="360"/>
+      </w:pPr>
+      <w:rPr>
+        <w:rFonts w:ascii="Courier New" w:hAnsi="Courier New" w:cs="Courier New" w:hint="default"/>
+      </w:rPr>
+    </w:lvl>
+    <w:lvl w:ilvl="2" w:tplc="0C090005" w:tentative="1">
+      <w:start w:val="1"/>
+      <w:numFmt w:val="bullet"/>
+      <w:lvlText w:val=""/>
+      <w:lvlJc w:val="left"/>
+      <w:pPr>
+        <w:ind w:left="2160" w:hanging="360"/>
+      </w:pPr>
+      <w:rPr>
+        <w:rFonts w:ascii="Wingdings" w:hAnsi="Wingdings" w:hint="default"/>
+      </w:rPr>
+    </w:lvl>
+    <w:lvl w:ilvl="3" w:tplc="0C090001" w:tentative="1">
+      <w:start w:val="1"/>
+      <w:numFmt w:val="bullet"/>
+      <w:lvlText w:val=""/>
+      <w:lvlJc w:val="left"/>
+      <w:pPr>
+        <w:ind w:left="2880" w:hanging="360"/>
+      </w:pPr>
+      <w:rPr>
+        <w:rFonts w:ascii="Symbol" w:hAnsi="Symbol" w:hint="default"/>
+      </w:rPr>
+    </w:lvl>
+    <w:lvl w:ilvl="4" w:tplc="0C090003" w:tentative="1">
+      <w:start w:val="1"/>
+      <w:numFmt w:val="bullet"/>
+      <w:lvlText w:val="o"/>
+      <w:lvlJc w:val="left"/>
+      <w:pPr>
+        <w:ind w:left="3600" w:hanging="360"/>
+      </w:pPr>
+      <w:rPr>
+        <w:rFonts w:ascii="Courier New" w:hAnsi="Courier New" w:cs="Courier New" w:hint="default"/>
+      </w:rPr>
+    </w:lvl>
+    <w:lvl w:ilvl="5" w:tplc="0C090005" w:tentative="1">
+      <w:start w:val="1"/>
+      <w:numFmt w:val="bullet"/>
+      <w:lvlText w:val=""/>
+      <w:lvlJc w:val="left"/>
+      <w:pPr>
+        <w:ind w:left="4320" w:hanging="360"/>
+      </w:pPr>
+      <w:rPr>
+        <w:rFonts w:ascii="Wingdings" w:hAnsi="Wingdings" w:hint="default"/>
+      </w:rPr>
+    </w:lvl>
+    <w:lvl w:ilvl="6" w:tplc="0C090001" w:tentative="1">
+      <w:start w:val="1"/>
+      <w:numFmt w:val="bullet"/>
+      <w:lvlText w:val=""/>
+      <w:lvlJc w:val="left"/>
+      <w:pPr>
+        <w:ind w:left="5040" w:hanging="360"/>
+      </w:pPr>
+      <w:rPr>
+        <w:rFonts w:ascii="Symbol" w:hAnsi="Symbol" w:hint="default"/>
+      </w:rPr>
+    </w:lvl>
+    <w:lvl w:ilvl="7" w:tplc="0C090003" w:tentative="1">
+      <w:start w:val="1"/>
+      <w:numFmt w:val="bullet"/>
+      <w:lvlText w:val="o"/>
+      <w:lvlJc w:val="left"/>
+      <w:pPr>
+        <w:ind w:left="5760" w:hanging="360"/>
+      </w:pPr>
+      <w:rPr>
+        <w:rFonts w:ascii="Courier New" w:hAnsi="Courier New" w:cs="Courier New" w:hint="default"/>
+      </w:rPr>
+    </w:lvl>
+    <w:lvl w:ilvl="8" w:tplc="0C090005" w:tentative="1">
+      <w:start w:val="1"/>
+      <w:numFmt w:val="bullet"/>
+      <w:lvlText w:val=""/>
+      <w:lvlJc w:val="left"/>
+      <w:pPr>
+        <w:ind w:left="6480" w:hanging="360"/>
+      </w:pPr>
+      <w:rPr>
+        <w:rFonts w:ascii="Wingdings" w:hAnsi="Wingdings" w:hint="default"/>
       </w:rPr>
     </w:lvl>
   </w:abstractNum>
@@ -1597,6 +2316,9 @@
   </w:num>
   <w:num w:numId="9" w16cid:durableId="1202792164">
     <w:abstractNumId w:val="0"/>
+  </w:num>
+  <w:num w:numId="10" w16cid:durableId="704215107">
+    <w:abstractNumId w:val="9"/>
   </w:num>
 </w:numbering>
 </file>
@@ -1994,6 +2716,7 @@
     <w:rPr>
       <w:rFonts w:ascii="Aptos" w:hAnsi="Aptos"/>
       <w:sz w:val="21"/>
+      <w:lang w:val="en-AU"/>
     </w:rPr>
   </w:style>
   <w:style w:type="paragraph" w:styleId="Heading1">
@@ -11126,7 +11849,7 @@
       </w:tcPr>
     </w:tblStylePr>
   </w:style>
-  <w:style w:type="table" w:styleId="ColorfulShading">
+  <w:style w:type="table" w:styleId="ColourfulShading">
     <w:name w:val="Colorful Shading"/>
     <w:basedOn w:val="TableNormal"/>
     <w:uiPriority w:val="71"/>
@@ -11241,7 +11964,7 @@
       </w:rPr>
     </w:tblStylePr>
   </w:style>
-  <w:style w:type="table" w:styleId="ColorfulShading-Accent1">
+  <w:style w:type="table" w:styleId="ColourfulShadingAccent1">
     <w:name w:val="Colorful Shading Accent 1"/>
     <w:basedOn w:val="TableNormal"/>
     <w:uiPriority w:val="71"/>
@@ -11356,7 +12079,7 @@
       </w:rPr>
     </w:tblStylePr>
   </w:style>
-  <w:style w:type="table" w:styleId="ColorfulShading-Accent2">
+  <w:style w:type="table" w:styleId="ColourfulShadingAccent2">
     <w:name w:val="Colorful Shading Accent 2"/>
     <w:basedOn w:val="TableNormal"/>
     <w:uiPriority w:val="71"/>
@@ -11471,7 +12194,7 @@
       </w:rPr>
     </w:tblStylePr>
   </w:style>
-  <w:style w:type="table" w:styleId="ColorfulShading-Accent3">
+  <w:style w:type="table" w:styleId="ColourfulShadingAccent3">
     <w:name w:val="Colorful Shading Accent 3"/>
     <w:basedOn w:val="TableNormal"/>
     <w:uiPriority w:val="71"/>
@@ -11576,7 +12299,7 @@
       </w:tcPr>
     </w:tblStylePr>
   </w:style>
-  <w:style w:type="table" w:styleId="ColorfulShading-Accent4">
+  <w:style w:type="table" w:styleId="ColourfulShadingAccent4">
     <w:name w:val="Colorful Shading Accent 4"/>
     <w:basedOn w:val="TableNormal"/>
     <w:uiPriority w:val="71"/>
@@ -11691,7 +12414,7 @@
       </w:rPr>
     </w:tblStylePr>
   </w:style>
-  <w:style w:type="table" w:styleId="ColorfulShading-Accent5">
+  <w:style w:type="table" w:styleId="ColourfulShadingAccent5">
     <w:name w:val="Colorful Shading Accent 5"/>
     <w:basedOn w:val="TableNormal"/>
     <w:uiPriority w:val="71"/>
@@ -11806,7 +12529,7 @@
       </w:rPr>
     </w:tblStylePr>
   </w:style>
-  <w:style w:type="table" w:styleId="ColorfulShading-Accent6">
+  <w:style w:type="table" w:styleId="ColourfulShadingAccent6">
     <w:name w:val="Colorful Shading Accent 6"/>
     <w:basedOn w:val="TableNormal"/>
     <w:uiPriority w:val="71"/>
@@ -11921,7 +12644,7 @@
       </w:rPr>
     </w:tblStylePr>
   </w:style>
-  <w:style w:type="table" w:styleId="ColorfulList">
+  <w:style w:type="table" w:styleId="ColourfulList">
     <w:name w:val="Colorful List"/>
     <w:basedOn w:val="TableNormal"/>
     <w:uiPriority w:val="72"/>
@@ -12000,7 +12723,7 @@
       </w:tcPr>
     </w:tblStylePr>
   </w:style>
-  <w:style w:type="table" w:styleId="ColorfulList-Accent1">
+  <w:style w:type="table" w:styleId="ColourfulListAccent1">
     <w:name w:val="Colorful List Accent 1"/>
     <w:basedOn w:val="TableNormal"/>
     <w:uiPriority w:val="72"/>
@@ -12079,7 +12802,7 @@
       </w:tcPr>
     </w:tblStylePr>
   </w:style>
-  <w:style w:type="table" w:styleId="ColorfulList-Accent2">
+  <w:style w:type="table" w:styleId="ColourfulListAccent2">
     <w:name w:val="Colorful List Accent 2"/>
     <w:basedOn w:val="TableNormal"/>
     <w:uiPriority w:val="72"/>
@@ -12158,7 +12881,7 @@
       </w:tcPr>
     </w:tblStylePr>
   </w:style>
-  <w:style w:type="table" w:styleId="ColorfulList-Accent3">
+  <w:style w:type="table" w:styleId="ColourfulListAccent3">
     <w:name w:val="Colorful List Accent 3"/>
     <w:basedOn w:val="TableNormal"/>
     <w:uiPriority w:val="72"/>
@@ -12237,7 +12960,7 @@
       </w:tcPr>
     </w:tblStylePr>
   </w:style>
-  <w:style w:type="table" w:styleId="ColorfulList-Accent4">
+  <w:style w:type="table" w:styleId="ColourfulListAccent4">
     <w:name w:val="Colorful List Accent 4"/>
     <w:basedOn w:val="TableNormal"/>
     <w:uiPriority w:val="72"/>
@@ -12316,7 +13039,7 @@
       </w:tcPr>
     </w:tblStylePr>
   </w:style>
-  <w:style w:type="table" w:styleId="ColorfulList-Accent5">
+  <w:style w:type="table" w:styleId="ColourfulListAccent5">
     <w:name w:val="Colorful List Accent 5"/>
     <w:basedOn w:val="TableNormal"/>
     <w:uiPriority w:val="72"/>
@@ -12395,7 +13118,7 @@
       </w:tcPr>
     </w:tblStylePr>
   </w:style>
-  <w:style w:type="table" w:styleId="ColorfulList-Accent6">
+  <w:style w:type="table" w:styleId="ColourfulListAccent6">
     <w:name w:val="Colorful List Accent 6"/>
     <w:basedOn w:val="TableNormal"/>
     <w:uiPriority w:val="72"/>
@@ -12474,7 +13197,7 @@
       </w:tcPr>
     </w:tblStylePr>
   </w:style>
-  <w:style w:type="table" w:styleId="ColorfulGrid">
+  <w:style w:type="table" w:styleId="ColourfulGrid">
     <w:name w:val="Colorful Grid"/>
     <w:basedOn w:val="TableNormal"/>
     <w:uiPriority w:val="73"/>
@@ -12547,7 +13270,7 @@
       </w:tcPr>
     </w:tblStylePr>
   </w:style>
-  <w:style w:type="table" w:styleId="ColorfulGrid-Accent1">
+  <w:style w:type="table" w:styleId="ColourfulGridAccent1">
     <w:name w:val="Colorful Grid Accent 1"/>
     <w:basedOn w:val="TableNormal"/>
     <w:uiPriority w:val="73"/>
@@ -12620,7 +13343,7 @@
       </w:tcPr>
     </w:tblStylePr>
   </w:style>
-  <w:style w:type="table" w:styleId="ColorfulGrid-Accent2">
+  <w:style w:type="table" w:styleId="ColourfulGridAccent2">
     <w:name w:val="Colorful Grid Accent 2"/>
     <w:basedOn w:val="TableNormal"/>
     <w:uiPriority w:val="73"/>
@@ -12693,7 +13416,7 @@
       </w:tcPr>
     </w:tblStylePr>
   </w:style>
-  <w:style w:type="table" w:styleId="ColorfulGrid-Accent3">
+  <w:style w:type="table" w:styleId="ColourfulGridAccent3">
     <w:name w:val="Colorful Grid Accent 3"/>
     <w:basedOn w:val="TableNormal"/>
     <w:uiPriority w:val="73"/>
@@ -12766,7 +13489,7 @@
       </w:tcPr>
     </w:tblStylePr>
   </w:style>
-  <w:style w:type="table" w:styleId="ColorfulGrid-Accent4">
+  <w:style w:type="table" w:styleId="ColourfulGridAccent4">
     <w:name w:val="Colorful Grid Accent 4"/>
     <w:basedOn w:val="TableNormal"/>
     <w:uiPriority w:val="73"/>
@@ -12839,7 +13562,7 @@
       </w:tcPr>
     </w:tblStylePr>
   </w:style>
-  <w:style w:type="table" w:styleId="ColorfulGrid-Accent5">
+  <w:style w:type="table" w:styleId="ColourfulGridAccent5">
     <w:name w:val="Colorful Grid Accent 5"/>
     <w:basedOn w:val="TableNormal"/>
     <w:uiPriority w:val="73"/>
@@ -12912,7 +13635,7 @@
       </w:tcPr>
     </w:tblStylePr>
   </w:style>
-  <w:style w:type="table" w:styleId="ColorfulGrid-Accent6">
+  <w:style w:type="table" w:styleId="ColourfulGridAccent6">
     <w:name w:val="Colorful Grid Accent 6"/>
     <w:basedOn w:val="TableNormal"/>
     <w:uiPriority w:val="73"/>

</xml_diff>

<commit_message>
Add .py file, reflection, comparison, ai_usage, and additionals
</commit_message>
<xml_diff>
--- a/stage01/Stage_1_Lab_Student_Handout.docx
+++ b/stage01/Stage_1_Lab_Student_Handout.docx
@@ -1409,7 +1409,47 @@
           <w:color w:val="31849B" w:themeColor="accent5" w:themeShade="BF"/>
         </w:rPr>
         <w:lastRenderedPageBreak/>
-        <w:t>Identified Limitations with the Programs:</w:t>
+        <w:t>Identified Limitations with the Programs</w:t>
+      </w:r>
+      <w:r>
+        <w:rPr>
+          <w:color w:val="31849B" w:themeColor="accent5" w:themeShade="BF"/>
+        </w:rPr>
+        <w:t xml:space="preserve"> (as given in the provided code for </w:t>
+      </w:r>
+      <w:r>
+        <w:rPr>
+          <w:i/>
+          <w:iCs/>
+          <w:color w:val="31849B" w:themeColor="accent5" w:themeShade="BF"/>
+        </w:rPr>
+        <w:t xml:space="preserve">task1 </w:t>
+      </w:r>
+      <w:r>
+        <w:rPr>
+          <w:color w:val="31849B" w:themeColor="accent5" w:themeShade="BF"/>
+        </w:rPr>
+        <w:t xml:space="preserve">and </w:t>
+      </w:r>
+      <w:r>
+        <w:rPr>
+          <w:i/>
+          <w:iCs/>
+          <w:color w:val="31849B" w:themeColor="accent5" w:themeShade="BF"/>
+        </w:rPr>
+        <w:t>task1enhanced</w:t>
+      </w:r>
+      <w:r>
+        <w:rPr>
+          <w:color w:val="31849B" w:themeColor="accent5" w:themeShade="BF"/>
+        </w:rPr>
+        <w:t>)</w:t>
+      </w:r>
+      <w:r>
+        <w:rPr>
+          <w:color w:val="31849B" w:themeColor="accent5" w:themeShade="BF"/>
+        </w:rPr>
+        <w:t>:</w:t>
       </w:r>
     </w:p>
     <w:p>
@@ -1933,6 +1973,56 @@
     <w:p>
       <w:r>
         <w:t>What engineering work remained for you?</w:t>
+      </w:r>
+    </w:p>
+    <w:p>
+      <w:pPr>
+        <w:rPr>
+          <w:b/>
+          <w:bCs/>
+          <w:color w:val="31849B" w:themeColor="accent5" w:themeShade="BF"/>
+        </w:rPr>
+      </w:pPr>
+      <w:r>
+        <w:rPr>
+          <w:b/>
+          <w:bCs/>
+          <w:color w:val="31849B" w:themeColor="accent5" w:themeShade="BF"/>
+        </w:rPr>
+        <w:t>Reflection:</w:t>
+      </w:r>
+    </w:p>
+    <w:p>
+      <w:pPr>
+        <w:rPr>
+          <w:color w:val="31849B" w:themeColor="accent5" w:themeShade="BF"/>
+        </w:rPr>
+      </w:pPr>
+      <w:r>
+        <w:rPr>
+          <w:color w:val="31849B" w:themeColor="accent5" w:themeShade="BF"/>
+        </w:rPr>
+        <w:t xml:space="preserve">AI is a powerful tool for programming that helps in the technical development of software. However, there are also severe limitations to the tool. On a base level, AI can help a user develop basic functionality </w:t>
+      </w:r>
+      <w:proofErr w:type="gramStart"/>
+      <w:r>
+        <w:rPr>
+          <w:color w:val="31849B" w:themeColor="accent5" w:themeShade="BF"/>
+        </w:rPr>
+        <w:t>and also</w:t>
+      </w:r>
+      <w:proofErr w:type="gramEnd"/>
+      <w:r>
+        <w:rPr>
+          <w:color w:val="31849B" w:themeColor="accent5" w:themeShade="BF"/>
+        </w:rPr>
+        <w:t xml:space="preserve"> understand inputs it is provided, giving insight and extrapolating that information to synthesise a response. However, AI, as a tool, also lacks context and greater planning regarding the design process. Furthermore, AI observably makes assumptions where additional context may not have been given, especially regarding cases such as input being valid. Although not shown in this example, AI has the possibility to also produce technically poor code that crashes or does not function as intended. And finally, AI does not produce testable nor easily readable code for an end user or stakeholders. Therefore, a software engineer still has a large amount of additional work to perform. This includes adding further documentation, testing functionality and considering edge cases within the scope of the program and problem. Furthermore, the software engineer has a greater responsibility in understanding the context of the problem, and delivering a product that clearly respects the requirements of the stakeholders, and the wider situation where it will be used. Overall, it is evident that, while AI is a useful tool, it is </w:t>
+      </w:r>
+      <w:r>
+        <w:rPr>
+          <w:color w:val="31849B" w:themeColor="accent5" w:themeShade="BF"/>
+        </w:rPr>
+        <w:t>deficient in solving technical problems and the aspects necessary to designing good software. Therefore, it is very important to preserve the role of software engineers in developing, implementing and producing, reliable software.</w:t>
       </w:r>
     </w:p>
     <w:p>

</xml_diff>